<commit_message>
fix(sg): update formatting in receipt
</commit_message>
<xml_diff>
--- a/document-merge-service/kt_sg/templatefiles/eingabequittung.docx
+++ b/document-merge-service/kt_sg/templatefiles/eingabequittung.docx
@@ -91,7 +91,7 @@
                         <w:txbxContent>
                           <w:p>
                             <w:pPr>
-                              <w:pStyle w:val="FrameContentsuser"/>
+                              <w:pStyle w:val="FrameContents"/>
                               <w:jc w:val="center"/>
                               <w:rPr>
                                 <w:b/>
@@ -131,7 +131,7 @@
                   <w:txbxContent>
                     <w:p>
                       <w:pPr>
-                        <w:pStyle w:val="FrameContentsuser"/>
+                        <w:pStyle w:val="FrameContents"/>
                         <w:jc w:val="center"/>
                         <w:rPr>
                           <w:b/>
@@ -190,17 +190,13 @@
     </w:p>
     <w:p>
       <w:pPr>
-        <w:pStyle w:val="Heading1"/>
-        <w:numPr>
-          <w:ilvl w:val="0"/>
-          <w:numId w:val="0"/>
-        </w:numPr>
-        <w:ind w:hanging="432" w:start="432"/>
-        <w:rPr/>
-      </w:pPr>
-      <w:r>
-        <w:rPr/>
-      </w:r>
+        <w:pStyle w:val="Normal"/>
+        <w:rPr/>
+      </w:pPr>
+      <w:r>
+        <w:rPr/>
+      </w:r>
+      <w:bookmarkEnd w:id="0"/>
     </w:p>
     <w:p>
       <w:pPr>
@@ -210,7 +206,6 @@
       <w:r>
         <w:rPr/>
       </w:r>
-      <w:bookmarkEnd w:id="0"/>
     </w:p>
     <w:p>
       <w:pPr>
@@ -388,15 +383,15 @@
         </w:tblCellMar>
       </w:tblPr>
       <w:tblGrid>
-        <w:gridCol w:w="2812"/>
+        <w:gridCol w:w="2811"/>
         <w:gridCol w:w="4228"/>
-        <w:gridCol w:w="2373"/>
+        <w:gridCol w:w="2374"/>
       </w:tblGrid>
       <w:tr>
         <w:trPr/>
         <w:tc>
           <w:tcPr>
-            <w:tcW w:w="2812" w:type="dxa"/>
+            <w:tcW w:w="2811" w:type="dxa"/>
             <w:tcBorders/>
           </w:tcPr>
           <w:p>
@@ -430,7 +425,7 @@
         </w:tc>
         <w:tc>
           <w:tcPr>
-            <w:tcW w:w="2373" w:type="dxa"/>
+            <w:tcW w:w="2374" w:type="dxa"/>
             <w:tcBorders/>
           </w:tcPr>
           <w:p>
@@ -464,6 +459,21 @@
     </w:p>
     <w:p>
       <w:pPr>
+        <w:pStyle w:val="Normal"/>
+        <w:tabs>
+          <w:tab w:val="clear" w:pos="708"/>
+          <w:tab w:val="left" w:pos="2794" w:leader="none"/>
+          <w:tab w:val="left" w:pos="7022" w:leader="none"/>
+        </w:tabs>
+        <w:bidi w:val="0"/>
+        <w:rPr/>
+      </w:pPr>
+      <w:r>
+        <w:rPr/>
+      </w:r>
+    </w:p>
+    <w:p>
+      <w:pPr>
         <w:pStyle w:val="Heading1"/>
         <w:numPr>
           <w:ilvl w:val="0"/>
@@ -555,15 +565,15 @@
         </w:tblCellMar>
       </w:tblPr>
       <w:tblGrid>
-        <w:gridCol w:w="2812"/>
+        <w:gridCol w:w="2811"/>
         <w:gridCol w:w="4228"/>
-        <w:gridCol w:w="2373"/>
+        <w:gridCol w:w="2374"/>
       </w:tblGrid>
       <w:tr>
         <w:trPr/>
         <w:tc>
           <w:tcPr>
-            <w:tcW w:w="2812" w:type="dxa"/>
+            <w:tcW w:w="2811" w:type="dxa"/>
             <w:tcBorders/>
           </w:tcPr>
           <w:p>
@@ -573,15 +583,7 @@
             </w:pPr>
             <w:r>
               <w:rPr/>
-              <w:t xml:space="preserve">{{ </w:t>
-            </w:r>
-            <w:r>
-              <w:rPr/>
-              <w:t>generatedBy</w:t>
-            </w:r>
-            <w:r>
-              <w:rPr/>
-              <w:t>.full</w:t>
+              <w:t>{{ generatedBy.full</w:t>
               <w:softHyphen/>
               <w:t>_name}}</w:t>
             </w:r>
@@ -599,29 +601,13 @@
             </w:pPr>
             <w:r>
               <w:rPr/>
-              <w:t xml:space="preserve">{{ </w:t>
-            </w:r>
-            <w:r>
-              <w:rPr/>
-              <w:t>generated</w:t>
-            </w:r>
-            <w:r>
-              <w:rPr/>
-              <w:t>By.</w:t>
-            </w:r>
-            <w:r>
-              <w:rPr/>
-              <w:t>username</w:t>
-            </w:r>
-            <w:r>
-              <w:rPr/>
-              <w:t xml:space="preserve"> }}</w:t>
+              <w:t>{{ generatedBy.username }}</w:t>
             </w:r>
           </w:p>
         </w:tc>
         <w:tc>
           <w:tcPr>
-            <w:tcW w:w="2373" w:type="dxa"/>
+            <w:tcW w:w="2374" w:type="dxa"/>
             <w:tcBorders/>
           </w:tcPr>
           <w:p>
@@ -652,6 +638,19 @@
     </w:p>
     <w:p>
       <w:pPr>
+        <w:pStyle w:val="Normal"/>
+        <w:tabs>
+          <w:tab w:val="clear" w:pos="708"/>
+          <w:tab w:val="left" w:pos="4536" w:leader="none"/>
+        </w:tabs>
+        <w:rPr/>
+      </w:pPr>
+      <w:r>
+        <w:rPr/>
+      </w:r>
+    </w:p>
+    <w:p>
+      <w:pPr>
         <w:pStyle w:val="Heading1"/>
         <w:numPr>
           <w:ilvl w:val="0"/>
@@ -739,15 +738,15 @@
         </w:tblCellMar>
       </w:tblPr>
       <w:tblGrid>
-        <w:gridCol w:w="2812"/>
+        <w:gridCol w:w="2811"/>
         <w:gridCol w:w="4228"/>
-        <w:gridCol w:w="2373"/>
+        <w:gridCol w:w="2374"/>
       </w:tblGrid>
       <w:tr>
         <w:trPr/>
         <w:tc>
           <w:tcPr>
-            <w:tcW w:w="2812" w:type="dxa"/>
+            <w:tcW w:w="2811" w:type="dxa"/>
             <w:tcBorders/>
           </w:tcPr>
           <w:p>
@@ -781,7 +780,7 @@
         </w:tc>
         <w:tc>
           <w:tcPr>
-            <w:tcW w:w="2373" w:type="dxa"/>
+            <w:tcW w:w="2374" w:type="dxa"/>
             <w:tcBorders/>
           </w:tcPr>
           <w:p>
@@ -815,12 +814,13 @@
     </w:p>
     <w:p>
       <w:pPr>
-        <w:pStyle w:val="Heading1"/>
-        <w:numPr>
-          <w:ilvl w:val="0"/>
-          <w:numId w:val="0"/>
-        </w:numPr>
-        <w:ind w:hanging="432" w:start="432"/>
+        <w:pStyle w:val="Normal"/>
+        <w:tabs>
+          <w:tab w:val="clear" w:pos="708"/>
+          <w:tab w:val="left" w:pos="2794" w:leader="none"/>
+          <w:tab w:val="left" w:pos="7022" w:leader="none"/>
+        </w:tabs>
+        <w:bidi w:val="0"/>
         <w:rPr/>
       </w:pPr>
       <w:r>
@@ -3351,15 +3351,15 @@
       <w:bCs/>
     </w:rPr>
   </w:style>
+  <w:style w:type="paragraph" w:styleId="FrameContents">
+    <w:name w:val="Frame Contents"/>
+    <w:basedOn w:val="Normal"/>
+    <w:qFormat/>
+    <w:pPr/>
+    <w:rPr/>
+  </w:style>
   <w:style w:type="paragraph" w:styleId="FrameContentsuser">
     <w:name w:val="Frame Contents (user)"/>
-    <w:basedOn w:val="Normal"/>
-    <w:qFormat/>
-    <w:pPr/>
-    <w:rPr/>
-  </w:style>
-  <w:style w:type="paragraph" w:styleId="FrameContents">
-    <w:name w:val="Frame Contents"/>
     <w:basedOn w:val="Normal"/>
     <w:qFormat/>
     <w:pPr/>

</xml_diff>